<commit_message>
Update About Me content template with new tagline
Add new hero tagline to the About_Me_Content.docx template: "Hi, I'm Jitika, a scientist driven by a simple question: how can a deeper understanding of biology help us build better medicines?"

Co-Authored-By: Claude Haiku 4.5 <noreply@anthropic.com>
</commit_message>
<xml_diff>
--- a/About_Me_Content.docx
+++ b/About_Me_Content.docx
@@ -21,6 +21,19 @@
     <w:p>
       <w:r>
         <w:t>Learning. Building. Discovering what's possible.</w:t>
+      </w:r>
+    </w:p>
+    <w:p>
+      <w:pPr>
+        <w:pStyle w:val="Heading2"/>
+      </w:pPr>
+      <w:r>
+        <w:t>Tagline (below hero statement):</w:t>
+      </w:r>
+    </w:p>
+    <w:p>
+      <w:r>
+        <w:t>Hi, I'm Jitika, a scientist driven by a simple question: how can a deeper understanding of biology help us build better medicines?</w:t>
       </w:r>
     </w:p>
     <w:p>

</xml_diff>

<commit_message>
Update About Me content template with complete narrative
Add all 6 sections to the living content template:
- PROLOGUE: There wasn't anyone left to teach us
- ABOUT: A little about me
- QUESTIONS: Questions that stayed with me
- BUILDING: Building
- PEOPLE: People
- WHY: Why this website exists

Now this template reflects the full narrative structure of the website.

Co-Authored-By: Claude Haiku 4.5 <noreply@anthropic.com>
</commit_message>
<xml_diff>
--- a/About_Me_Content.docx
+++ b/About_Me_Content.docx
@@ -7,7 +7,7 @@
         <w:pStyle w:val="Heading1"/>
       </w:pPr>
       <w:r>
-        <w:t>About Me Tab Content</w:t>
+        <w:t>About Me Tab - Complete Narrative Content</w:t>
       </w:r>
     </w:p>
     <w:p>
@@ -15,12 +15,63 @@
         <w:pStyle w:val="Heading2"/>
       </w:pPr>
       <w:r>
-        <w:t>Hero Statement:</w:t>
+        <w:t>PROLOGUE: There wasn't anyone left to teach us.</w:t>
       </w:r>
     </w:p>
     <w:p>
       <w:r>
-        <w:t>Learning. Building. Discovering what's possible.</w:t>
+        <w:t>Within a few weeks, our lab had lost the two postdoctoral researchers who knew how to perform many of our core experiments. Overnight, another graduate student and I found ourselves trying to learn procedures that nobody around us could teach anymore.</w:t>
+      </w:r>
+    </w:p>
+    <w:p>
+      <w:r>
+        <w:t>So we did what we could:</w:t>
+        <w:br/>
+        <w:t>We watched JOVE videos.</w:t>
+        <w:br/>
+        <w:t>We replayed old notes.</w:t>
+        <w:br/>
+        <w:t>We practiced.</w:t>
+        <w:br/>
+        <w:t>We made mistakes.</w:t>
+        <w:br/>
+        <w:t>We started again.</w:t>
+      </w:r>
+    </w:p>
+    <w:p>
+      <w:r>
+        <w:t>Around the same time, I found myself facing a completely different problem.</w:t>
+      </w:r>
+    </w:p>
+    <w:p>
+      <w:r>
+        <w:t>If I was going to spend months learning image analysis, why was I using software simply because it was what everyone else in the lab used?</w:t>
+      </w:r>
+    </w:p>
+    <w:p>
+      <w:r>
+        <w:t>So I started over there too.</w:t>
+        <w:br/>
+        <w:t>I taught myself Imaris and rebuilt much of our image analysis workflow from scratch.</w:t>
+      </w:r>
+    </w:p>
+    <w:p>
+      <w:r>
+        <w:t>At the time, those felt like unrelated problems.</w:t>
+        <w:br/>
+        <w:t>Looking back, I think they were the same.</w:t>
+      </w:r>
+    </w:p>
+    <w:p>
+      <w:r>
+        <w:t>QUOTE BOX:</w:t>
+        <w:br/>
+        <w:t>"Neither began with knowing how.</w:t>
+        <w:br/>
+        <w:t>Both began with believing the problem was worth learning for.</w:t>
+        <w:br/>
+        <w:br/>
+        <w:t>I didn't realize it then, but I'd been answering that same question for most of my life."</w:t>
       </w:r>
     </w:p>
     <w:p>
@@ -28,12 +79,17 @@
         <w:pStyle w:val="Heading2"/>
       </w:pPr>
       <w:r>
-        <w:t>Tagline (below hero statement):</w:t>
+        <w:t>ABOUT: A little about me</w:t>
       </w:r>
     </w:p>
     <w:p>
       <w:r>
-        <w:t>Hi, I'm Jitika, a scientist driven by a simple question: how can a deeper understanding of biology help us build better medicines?</w:t>
+        <w:t>Hi, I'm Jitika.</w:t>
+      </w:r>
+    </w:p>
+    <w:p>
+      <w:r>
+        <w:t>For a long time, I told one story about becoming a neuroscientist. Looking back, I don't think that's true. I think it's about becoming someone who grows into the problems she cares deeply enough to solve. I don't think I've ever followed a master plan. Instead, my life has been shaped by questions that kept getting bigger.</w:t>
       </w:r>
     </w:p>
     <w:p>
@@ -41,42 +97,152 @@
         <w:pStyle w:val="Heading2"/>
       </w:pPr>
       <w:r>
-        <w:t>About Section - 7 Paragraphs:</w:t>
+        <w:t>QUESTIONS: Questions that stayed with me</w:t>
       </w:r>
     </w:p>
     <w:p>
       <w:r>
-        <w:t>I've always been drawn to understanding how complex systems work. The brain just happens to be the most fascinating one I've found.</w:t>
+        <w:t>My first experience with research introduced me to problem-solving through iterative thinking and applied β aggregation.</w:t>
       </w:r>
     </w:p>
     <w:p>
       <w:r>
-        <w:t>My interest in Alzheimer's disease began with an undergraduate research project that first introduced me to protein misfolding through amyloid-β aggregation, one of the defining pathological features of the disease. I became fascinated by the molecular events that initiate disease, believing that understanding how pathology begins could help explain how it progresses. But the deeper I explored these mechanisms, the more I realized that neurodegeneration could not be explained by proteins alone. What started as a question about molecular pathology gradually became a much broader question: how do events occurring at one biological scale ultimately shape disease at another?</w:t>
+        <w:t>When it came time to choose a master's lab, I surprised myself.</w:t>
       </w:r>
     </w:p>
     <w:p>
       <w:r>
-        <w:t>That question has guided every step of my PhD. Rather than following a single pathway, each project expanded the way I thought about neurodegeneration. What began as a question about protein misfolding grew to encompass cellular metabolism, neuroimmune interactions, human disease models, and therapeutic development. Looking back, I don't see these as different research directions, but as different perspectives on the same biological problem.</w:t>
+        <w:t>I could have availed with strategy. Instead, I returned to a question that had slowly stayed with me for almost two years. Simply because I was still curious.</w:t>
       </w:r>
     </w:p>
     <w:p>
       <w:r>
-        <w:t>One of my favorite parts of research has been collaborating with people who think completely differently from I do. Working alongside biologists, chemists, computational scientists, and engineers has taught me that meaningful progress rarely comes from studying one mechanism in isolation. The most rewarding collaborations have been the ones where different perspectives come together to solve problems that none of us could have tackled alone.</w:t>
+        <w:t>When I left that lab six months later, I didn't immediately start studying Alzheimer's. Instead, I spent the rest of my undergraduate years studying protein disease via my thesis.</w:t>
       </w:r>
     </w:p>
     <w:p>
       <w:r>
-        <w:t>That way of thinking has become one of the things I enjoy most about science. I love connecting ideas that don't obviously belong together and building tools that make difficult problems easier to solve. Whether it's developing new experimental models, creating image analysis pipelines, or exploring how AI can complement experimental biology, I enjoy building things that help us ask better questions.</w:t>
+        <w:t>Looking back, those experiences gave me two different gifts.</w:t>
       </w:r>
     </w:p>
     <w:p>
       <w:r>
-        <w:t>Outside the lab, those same instincts shape many of the things I enjoy. I love building practical tools that make everyday life a little easier, exploring new places through camping, and investing in the friendships that have become one of the most meaningful parts of my life. To me, curiosity isn't confined to research. It's simply how I move through the world.</w:t>
+        <w:t>HIGHLIGHTS:</w:t>
+        <w:br/>
+        <w:t>"The first introduced me to a question I couldn't quite let go of."</w:t>
+        <w:br/>
+        <w:t>"The second made me fall in love with research itself."</w:t>
       </w:r>
     </w:p>
     <w:p>
       <w:r>
-        <w:t>Today, I'm excited by research that bridges fundamental biology and therapeutic discovery, asking not only what drives neurodegeneration but also how we can translate those insights into better interventions. Ultimately, I want my work to help bridge the gap between understanding neurodegeneration and changing its course.</w:t>
+        <w:t>QUOTE BOX:</w:t>
+        <w:br/>
+        <w:t>Protein aggregation led to lipid metabolism</w:t>
+        <w:br/>
+        <w:t>Lipid metabolism led to neuroimmune interactions</w:t>
+        <w:br/>
+        <w:t>These connections eventually expanded into human disease models and therapeutic development.</w:t>
+        <w:br/>
+        <w:br/>
+        <w:t>"I don't think I changed research directions.</w:t>
+        <w:br/>
+        <w:t>I think I kept zooming out."</w:t>
+      </w:r>
+    </w:p>
+    <w:p>
+      <w:pPr>
+        <w:pStyle w:val="Heading2"/>
+      </w:pPr>
+      <w:r>
+        <w:t>BUILDING: Building</w:t>
+      </w:r>
+    </w:p>
+    <w:p>
+      <w:r>
+        <w:t>Somewhere during my PhD, I realized that what excited me wasn't only discovering biology. It was building.</w:t>
+      </w:r>
+    </w:p>
+    <w:p>
+      <w:r>
+        <w:t>VISUAL ELEMENTS (5 icons/items):</w:t>
+        <w:br/>
+        <w:t>🧪 Building experimental models</w:t>
+        <w:br/>
+        <w:t>📊 Building image analysis pipelines</w:t>
+        <w:br/>
+        <w:t>🤝 Building collaborations</w:t>
+        <w:br/>
+        <w:t>❓ Building better ways to ask difficult questions</w:t>
+        <w:br/>
+        <w:t>💊 Building toward better medicines</w:t>
+      </w:r>
+    </w:p>
+    <w:p>
+      <w:r>
+        <w:t>I've never been interested in collecting techniques. I enjoy solving a problem demands. The tools change. The questions evolve. The mindset stays the same.</w:t>
+      </w:r>
+    </w:p>
+    <w:p>
+      <w:pPr>
+        <w:pStyle w:val="Heading2"/>
+      </w:pPr>
+      <w:r>
+        <w:t>PEOPLE: People</w:t>
+      </w:r>
+    </w:p>
+    <w:p>
+      <w:r>
+        <w:t>Looking back, almost every meaningful opportunity in my life has come through people I've had to learn it.</w:t>
+      </w:r>
+    </w:p>
+    <w:p>
+      <w:r>
+        <w:t>• An undergraduate advisor who trusted me with real responsibility</w:t>
+        <w:br/>
+        <w:t>• A postdoctoral researcher who eventually raised to the persistent student</w:t>
+        <w:br/>
+        <w:t>• A former lab member who helped me find the lab</w:t>
+        <w:br/>
+        <w:t>• A colleague who gave me permission calls when I had just moved halfway across the world</w:t>
+        <w:br/>
+        <w:t>• Parents who simply believed I should build a life</w:t>
+      </w:r>
+    </w:p>
+    <w:p>
+      <w:r>
+        <w:t>QUOTE BOX:</w:t>
+        <w:br/>
+        <w:t>"It's about people who challenge one another, trust one another, and build something together that none of them could have built alone. That's the kind of scientist I hope to become."</w:t>
+      </w:r>
+    </w:p>
+    <w:p>
+      <w:pPr>
+        <w:pStyle w:val="Heading2"/>
+      </w:pPr>
+      <w:r>
+        <w:t>WHY: Why this website exists</w:t>
+      </w:r>
+    </w:p>
+    <w:p>
+      <w:r>
+        <w:t>A CV can tell you what I've done.</w:t>
+        <w:br/>
+        <w:t>It can't tell you how I think.</w:t>
+        <w:br/>
+        <w:t>Or why my questions keep changing.</w:t>
+      </w:r>
+    </w:p>
+    <w:p>
+      <w:r>
+        <w:t>I wanted one place where those parts of my could exist alongside the science. Whether it's a scientific question, a shared curiosity, or simply a way of thinking, I genuinely love to hear from you.</w:t>
+      </w:r>
+    </w:p>
+    <w:p>
+      <w:r>
+        <w:t>ITALICIZED CLOSING:</w:t>
+        <w:br/>
+        <w:t>"After all, every meaningful chapter of my own story began with a conversation."</w:t>
       </w:r>
     </w:p>
     <w:sectPr>

</xml_diff>